<commit_message>
Phase 4 complete: Track C gates, handbook regenerated, Track A facts rechecked, Pyodide package timeout fix
- Recheck 20 Track A claims on docs.databricks.com; mark verified with the check date.
- Note that autoMerge is now labelled legacy (A3-L2).
- VERSIONS.md: DBR 17.3 LTS (Python 3.12.3), DBR 18 phase, Free Edition limits, serverless limits.
- pyrunner: give a first package download the long timeout even on a warm worker.
  Found by running all 106 Python solutions in Pyodide 314.0.7 from the CDN.
- Regenerate handbooks and practicals for Track C.

Co-Authored-By: Claude Opus 5.5 <noreply@anthropic.com>
Claude-Session: https://claude.ai/code/session_01115scNbPGEnHTmmnr4vEBh
</commit_message>
<xml_diff>
--- a/site/downloads/handbook-A10.docx
+++ b/site/downloads/handbook-A10.docx
@@ -1754,7 +1754,7 @@
           <w:b w:val="0"/>
           <w:i w:val="0"/>
         </w:rPr>
-        <w:t>Git folders: per-user branches under /Workspace/Users/, trunk-based strategy, production Git folders updated only by automation, bundles recommended for deployment. (search-only: https://docs.databricks.com/aws/en/repos/ci-cd)</w:t>
+        <w:t>Git folders: per-user branches under /Workspace/Users/, trunk-based strategy, production Git folders updated only by automation, bundles recommended for deployment. (verified: https://docs.databricks.com/aws/en/repos/ci-cd (checked 2026-09-25))</w:t>
       </w:r>
     </w:p>
     <w:p>
@@ -1766,7 +1766,7 @@
           <w:b w:val="0"/>
           <w:i w:val="0"/>
         </w:rPr>
-        <w:t>dbutils.secrets.get(scope, key) reads a secret; values are shown as [REDACTED]; redaction does not prevent deliberate transformations. (search-only: https://docs.databricks.com/aws/en/security/secrets/)</w:t>
+        <w:t>dbutils.secrets.get(scope, key) reads a secret; values are shown as [REDACTED]; redaction does not prevent deliberate transformations. (verified: https://docs.databricks.com/aws/en/security/secrets/ (checked 2026-09-25))</w:t>
       </w:r>
     </w:p>
     <w:p>
@@ -5197,7 +5197,7 @@
           <w:b w:val="0"/>
           <w:i w:val="0"/>
         </w:rPr>
-        <w:t>Databricks Asset Bundles were renamed Declarative Automation Bundles on 16 March 2026; the change is non-breaking. (search-only: https://docs.databricks.com/aws/en/release-notes/dev-tools/bundles)</w:t>
+        <w:t>Databricks Asset Bundles were renamed Declarative Automation Bundles on 16 March 2026; the change is non-breaking. (verified: https://docs.databricks.com/aws/en/release-notes/dev-tools/bundles (checked 2026-09-25))</w:t>
       </w:r>
     </w:p>
     <w:p>
@@ -5221,7 +5221,7 @@
           <w:b w:val="0"/>
           <w:i w:val="0"/>
         </w:rPr>
-        <w:t>Development mode prefixes resources with [dev ${workspace.current_user.short_name}] and pauses schedules and triggers. (search-only: https://docs.databricks.com/aws/en/dev-tools/bundles/deployment-modes)</w:t>
+        <w:t>Development mode prefixes resources with [dev ${workspace.current_user.short_name}] and pauses schedules and triggers. (verified: https://docs.databricks.com/aws/en/dev-tools/bundles/deployment-modes (checked 2026-09-25))</w:t>
       </w:r>
     </w:p>
     <w:p>
@@ -5233,7 +5233,7 @@
           <w:b w:val="0"/>
           <w:i w:val="0"/>
         </w:rPr>
-        <w:t>Notebook tasks read job parameters with dbutils.widgets.get. (search-only: https://docs.databricks.com/aws/en/jobs/parameter-use)</w:t>
+        <w:t>Notebook tasks read job parameters with dbutils.widgets.get. (verified: https://docs.databricks.com/aws/en/jobs/parameter-use (checked 2026-09-25))</w:t>
       </w:r>
     </w:p>
     <w:p>
@@ -7962,7 +7962,7 @@
           <w:b w:val="0"/>
           <w:i w:val="0"/>
         </w:rPr>
-        <w:t>Databricks recommends OAuth M2M for service principals in CI; environment variables DATABRICKS_HOST, DATABRICKS_CLIENT_ID and DATABRICKS_CLIENT_SECRET; github-oidc workload identity federation needs no client secret. (search-only: https://docs.databricks.com/aws/en/dev-tools/auth/oauth-m2m and https://docs.databricks.com/aws/en/dev-tools/bundles/authentication)</w:t>
+        <w:t>Databricks recommends OAuth M2M for service principals in CI; environment variables DATABRICKS_HOST, DATABRICKS_CLIENT_ID and DATABRICKS_CLIENT_SECRET; github-oidc workload identity federation needs no client secret. (verified: https://docs.databricks.com/aws/en/dev-tools/auth/oauth-m2m and https://docs.databricks.com/aws/en/dev-tools/bundles/authentication (checked 2026-09-25))</w:t>
       </w:r>
     </w:p>
     <w:p>

</xml_diff>

<commit_message>
Add a brief before every code editor: steps, the checks your code must pass, the shape of the answer and an opt-in checklist
The brief derives from each exercise's own tests, rules and reference solution,
so the app and the handbook show the same text. Python answers show stub
signatures with their docstring line. SQL, DAX and KQL answers show a clause
outline. Sealed modules never show the shape. The 390px sweep now opens every
brief section.

Co-Authored-By: Claude Opus 5.5 <noreply@anthropic.com>
Claude-Session: https://claude.ai/code/session_01115scNbPGEnHTmmnr4vEBh
</commit_message>
<xml_diff>
--- a/site/downloads/handbook-A10.docx
+++ b/site/downloads/handbook-A10.docx
@@ -5041,6 +5041,194 @@
         <w:t xml:space="preserve"> is empty.</w:t>
       </w:r>
     </w:p>
+    <w:p>
+      <w:r>
+        <w:rPr>
+          <w:b w:val="0"/>
+          <w:i w:val="0"/>
+        </w:rPr>
+        <w:t>Your code must pass these checks:</w:t>
+      </w:r>
+    </w:p>
+    <w:p>
+      <w:pPr>
+        <w:pStyle w:val="ListBullet"/>
+      </w:pPr>
+      <w:r>
+        <w:rPr>
+          <w:b w:val="0"/>
+          <w:i w:val="0"/>
+        </w:rPr>
+        <w:t>Return both parameters as read from widgets.get.</w:t>
+      </w:r>
+    </w:p>
+    <w:p>
+      <w:pPr>
+        <w:pStyle w:val="ListBullet"/>
+      </w:pPr>
+      <w:r>
+        <w:rPr>
+          <w:b w:val="0"/>
+          <w:i w:val="0"/>
+        </w:rPr>
+        <w:t>An unexpected catalog must raise ValueError before any data moves.</w:t>
+      </w:r>
+    </w:p>
+    <w:p>
+      <w:pPr>
+        <w:pStyle w:val="ListBullet"/>
+      </w:pPr>
+      <w:r>
+        <w:rPr>
+          <w:b w:val="0"/>
+          <w:i w:val="0"/>
+        </w:rPr>
+        <w:t>An empty wave_id must raise ValueError.</w:t>
+      </w:r>
+    </w:p>
+    <w:p>
+      <w:r>
+        <w:rPr>
+          <w:b w:val="0"/>
+          <w:i w:val="0"/>
+        </w:rPr>
+        <w:t>Shape of the answer. The reference solution defines these names. Write the bodies yourself.</w:t>
+      </w:r>
+    </w:p>
+    <w:tbl>
+      <w:tblPr>
+        <w:tblW w:type="auto" w:w="0"/>
+        <w:jc w:val="left"/>
+        <w:tblLook w:firstColumn="1" w:firstRow="1" w:lastColumn="0" w:lastRow="0" w:noHBand="0" w:noVBand="1" w:val="04A0"/>
+      </w:tblPr>
+      <w:tblGrid>
+        <w:gridCol w:w="8221"/>
+      </w:tblGrid>
+      <w:tr>
+        <w:tc>
+          <w:tcPr>
+            <w:tcW w:type="dxa" w:w="8221"/>
+            <w:shd w:val="clear" w:color="auto" w:fill="F2F4F7"/>
+          </w:tcPr>
+          <w:p>
+            <w:pPr>
+              <w:spacing w:before="0" w:after="0" w:line="240" w:lineRule="auto"/>
+              <w:ind w:left="567" w:hanging="567"/>
+            </w:pPr>
+            <w:r>
+              <w:rPr>
+                <w:rFonts w:ascii="Consolas" w:hAnsi="Consolas" w:eastAsia="Consolas"/>
+                <w:b w:val="0"/>
+                <w:color w:val="5B6875"/>
+                <w:sz w:val="16"/>
+              </w:rPr>
+              <w:t xml:space="preserve">   1  </w:t>
+            </w:r>
+            <w:r>
+              <w:rPr>
+                <w:rFonts w:ascii="Consolas" w:hAnsi="Consolas" w:eastAsia="Consolas"/>
+                <w:b w:val="0"/>
+                <w:sz w:val="16"/>
+              </w:rPr>
+              <w:t># Module constant.</w:t>
+            </w:r>
+          </w:p>
+          <w:p>
+            <w:pPr>
+              <w:spacing w:before="0" w:after="0" w:line="240" w:lineRule="auto"/>
+              <w:ind w:left="567" w:hanging="567"/>
+            </w:pPr>
+            <w:r>
+              <w:rPr>
+                <w:rFonts w:ascii="Consolas" w:hAnsi="Consolas" w:eastAsia="Consolas"/>
+                <w:b w:val="0"/>
+                <w:color w:val="5B6875"/>
+                <w:sz w:val="16"/>
+              </w:rPr>
+              <w:t xml:space="preserve">   2  </w:t>
+            </w:r>
+            <w:r>
+              <w:rPr>
+                <w:rFonts w:ascii="Consolas" w:hAnsi="Consolas" w:eastAsia="Consolas"/>
+                <w:b w:val="0"/>
+                <w:sz w:val="16"/>
+              </w:rPr>
+              <w:t>ALLOWED_CATALOGS = ...</w:t>
+            </w:r>
+          </w:p>
+          <w:p>
+            <w:pPr>
+              <w:spacing w:before="0" w:after="0" w:line="240" w:lineRule="auto"/>
+              <w:ind w:left="567" w:hanging="567"/>
+            </w:pPr>
+            <w:r>
+              <w:rPr>
+                <w:rFonts w:ascii="Consolas" w:hAnsi="Consolas" w:eastAsia="Consolas"/>
+                <w:b w:val="0"/>
+                <w:color w:val="5B6875"/>
+                <w:sz w:val="16"/>
+              </w:rPr>
+              <w:t xml:space="preserve">   3  </w:t>
+            </w:r>
+            <w:r>
+              <w:rPr>
+                <w:rFonts w:ascii="Consolas" w:hAnsi="Consolas" w:eastAsia="Consolas"/>
+                <w:b w:val="0"/>
+                <w:sz w:val="16"/>
+              </w:rPr>
+              <w:t xml:space="preserve"> </w:t>
+            </w:r>
+          </w:p>
+          <w:p>
+            <w:pPr>
+              <w:spacing w:before="0" w:after="0" w:line="240" w:lineRule="auto"/>
+              <w:ind w:left="567" w:hanging="567"/>
+            </w:pPr>
+            <w:r>
+              <w:rPr>
+                <w:rFonts w:ascii="Consolas" w:hAnsi="Consolas" w:eastAsia="Consolas"/>
+                <w:b w:val="0"/>
+                <w:color w:val="5B6875"/>
+                <w:sz w:val="16"/>
+              </w:rPr>
+              <w:t xml:space="preserve">   4  </w:t>
+            </w:r>
+            <w:r>
+              <w:rPr>
+                <w:rFonts w:ascii="Consolas" w:hAnsi="Consolas" w:eastAsia="Consolas"/>
+                <w:b w:val="0"/>
+                <w:sz w:val="16"/>
+              </w:rPr>
+              <w:t># Read and validate the job parameters passed to this notebook.</w:t>
+            </w:r>
+          </w:p>
+          <w:p>
+            <w:pPr>
+              <w:spacing w:before="0" w:after="0" w:line="240" w:lineRule="auto"/>
+              <w:ind w:left="567" w:hanging="567"/>
+            </w:pPr>
+            <w:r>
+              <w:rPr>
+                <w:rFonts w:ascii="Consolas" w:hAnsi="Consolas" w:eastAsia="Consolas"/>
+                <w:b w:val="0"/>
+                <w:color w:val="5B6875"/>
+                <w:sz w:val="16"/>
+              </w:rPr>
+              <w:t xml:space="preserve">   5  </w:t>
+            </w:r>
+            <w:r>
+              <w:rPr>
+                <w:rFonts w:ascii="Consolas" w:hAnsi="Consolas" w:eastAsia="Consolas"/>
+                <w:b w:val="0"/>
+                <w:sz w:val="16"/>
+              </w:rPr>
+              <w:t>def read_job_parameters(widgets: object) -&gt; dict[str, str]: ...</w:t>
+            </w:r>
+          </w:p>
+        </w:tc>
+      </w:tr>
+    </w:tbl>
+    <w:p/>
     <w:p>
       <w:r>
         <w:rPr>

</xml_diff>

<commit_message>
Teach before you test: a primer on every exercise that needs something its lesson has not explained
53 exercises gain a "What you need to know" box with a short explanation and
an example on other data, checked against the pinned library versions. A new
gate, tests/content/test_taught.py, fails the build when an exercise uses a
function, method, import or keyword that no lesson, earlier lesson or primer
explains. Spot-the-bug primers explain the code without pointing at the bug.

Also fixes the light-theme highlight CSS, whose selectors applied every token
rule, including the red error border, to the code box itself.

Co-Authored-By: Claude Opus 5.5 <noreply@anthropic.com>
Claude-Session: https://claude.ai/code/session_01115scNbPGEnHTmmnr4vEBh
</commit_message>
<xml_diff>
--- a/site/downloads/handbook-A10.docx
+++ b/site/downloads/handbook-A10.docx
@@ -1337,6 +1337,77 @@
           <w:i w:val="0"/>
         </w:rPr>
         <w:t>A reviewer blocks this pull request. Tap the line that must never be committed, then rewrite the module.</w:t>
+      </w:r>
+    </w:p>
+    <w:p>
+      <w:r>
+        <w:rPr>
+          <w:b/>
+          <w:i w:val="0"/>
+        </w:rPr>
+        <w:t>What you need to know.</w:t>
+      </w:r>
+    </w:p>
+    <w:p>
+      <w:r>
+        <w:rPr>
+          <w:rFonts w:ascii="Consolas" w:hAnsi="Consolas" w:eastAsia="Consolas"/>
+          <w:b w:val="0"/>
+          <w:sz w:val="19"/>
+        </w:rPr>
+        <w:t>requests.get(url, headers={...}, timeout=30)</w:t>
+      </w:r>
+      <w:r>
+        <w:rPr>
+          <w:b w:val="0"/>
+          <w:i w:val="0"/>
+        </w:rPr>
+        <w:t xml:space="preserve"> sends an HTTP GET request and returns a </w:t>
+      </w:r>
+      <w:r>
+        <w:rPr>
+          <w:rFonts w:ascii="Consolas" w:hAnsi="Consolas" w:eastAsia="Consolas"/>
+          <w:b w:val="0"/>
+          <w:sz w:val="19"/>
+        </w:rPr>
+        <w:t>requests.Response</w:t>
+      </w:r>
+      <w:r>
+        <w:rPr>
+          <w:b w:val="0"/>
+          <w:i w:val="0"/>
+        </w:rPr>
+        <w:t xml:space="preserve">, which holds the status code and the body. An </w:t>
+      </w:r>
+      <w:r>
+        <w:rPr>
+          <w:rFonts w:ascii="Consolas" w:hAnsi="Consolas" w:eastAsia="Consolas"/>
+          <w:b w:val="0"/>
+          <w:sz w:val="19"/>
+        </w:rPr>
+        <w:t>Authorization: Bearer &lt;token&gt;</w:t>
+      </w:r>
+      <w:r>
+        <w:rPr>
+          <w:b w:val="0"/>
+          <w:i w:val="0"/>
+        </w:rPr>
+        <w:t xml:space="preserve"> header sends the caller's access token. </w:t>
+      </w:r>
+      <w:r>
+        <w:rPr>
+          <w:rFonts w:ascii="Consolas" w:hAnsi="Consolas" w:eastAsia="Consolas"/>
+          <w:b w:val="0"/>
+          <w:sz w:val="19"/>
+        </w:rPr>
+        <w:t>timeout</w:t>
+      </w:r>
+      <w:r>
+        <w:rPr>
+          <w:b w:val="0"/>
+          <w:i w:val="0"/>
+        </w:rPr>
+        <w:t xml:space="preserve"> stops the call from waiting forever.</w:t>
       </w:r>
     </w:p>
     <w:tbl>

</xml_diff>